<commit_message>
API, Apahe, CHange suimmry, Manusl Global Map and Map Editor
</commit_message>
<xml_diff>
--- a/Apache.docx
+++ b/Apache.docx
@@ -1,6 +1,6 @@
 
 <file path=word/document.xml><?xml version="1.0" encoding="utf-8"?>
-<w:document xmlns:wpc="http://schemas.microsoft.com/office/word/2010/wordprocessingCanvas" xmlns:cx="http://schemas.microsoft.com/office/drawing/2014/chartex" xmlns:cx1="http://schemas.microsoft.com/office/drawing/2015/9/8/chartex" xmlns:cx2="http://schemas.microsoft.com/office/drawing/2015/10/21/chartex" xmlns:cx3="http://schemas.microsoft.com/office/drawing/2016/5/9/chartex" xmlns:cx4="http://schemas.microsoft.com/office/drawing/2016/5/10/chartex" xmlns:cx5="http://schemas.microsoft.com/office/drawing/2016/5/11/chartex" xmlns:cx6="http://schemas.microsoft.com/office/drawing/2016/5/12/chartex" xmlns:cx7="http://schemas.microsoft.com/office/drawing/2016/5/13/chartex" xmlns:cx8="http://schemas.microsoft.com/office/drawing/2016/5/14/chartex" xmlns:mc="http://schemas.openxmlformats.org/markup-compatibility/2006" xmlns:aink="http://schemas.microsoft.com/office/drawing/2016/ink" xmlns:am3d="http://schemas.microsoft.com/office/drawing/2017/model3d" xmlns:o="urn:schemas-microsoft-com:office:office" xmlns:oel="http://schemas.microsoft.com/office/2019/extlst" xmlns:r="http://schemas.openxmlformats.org/officeDocument/2006/relationships" xmlns:m="http://schemas.openxmlformats.org/officeDocument/2006/math" xmlns:v="urn:schemas-microsoft-com:vml" xmlns:wp14="http://schemas.microsoft.com/office/word/2010/wordprocessingDrawing" xmlns:wp="http://schemas.openxmlformats.org/drawingml/2006/wordprocessingDrawing" xmlns:w10="urn:schemas-microsoft-com:office:word" xmlns:w="http://schemas.openxmlformats.org/wordprocessingml/2006/main" xmlns:w14="http://schemas.microsoft.com/office/word/2010/wordml" xmlns:w15="http://schemas.microsoft.com/office/word/2012/wordml" xmlns:w16cex="http://schemas.microsoft.com/office/word/2018/wordml/cex" xmlns:w16cid="http://schemas.microsoft.com/office/word/2016/wordml/cid" xmlns:w16="http://schemas.microsoft.com/office/word/2018/wordml" xmlns:w16du="http://schemas.microsoft.com/office/word/2023/wordml/word16du" xmlns:w16sdtdh="http://schemas.microsoft.com/office/word/2020/wordml/sdtdatahash" xmlns:w16se="http://schemas.microsoft.com/office/word/2015/wordml/symex" xmlns:wpg="http://schemas.microsoft.com/office/word/2010/wordprocessingGroup" xmlns:wpi="http://schemas.microsoft.com/office/word/2010/wordprocessingInk" xmlns:wne="http://schemas.microsoft.com/office/word/2006/wordml" xmlns:wps="http://schemas.microsoft.com/office/word/2010/wordprocessingShape" mc:Ignorable="w14 w15 w16se w16cid w16 w16cex w16sdtdh w16du wp14">
+<w:document xmlns:wpc="http://schemas.microsoft.com/office/word/2010/wordprocessingCanvas" xmlns:cx="http://schemas.microsoft.com/office/drawing/2014/chartex" xmlns:cx1="http://schemas.microsoft.com/office/drawing/2015/9/8/chartex" xmlns:cx2="http://schemas.microsoft.com/office/drawing/2015/10/21/chartex" xmlns:cx3="http://schemas.microsoft.com/office/drawing/2016/5/9/chartex" xmlns:cx4="http://schemas.microsoft.com/office/drawing/2016/5/10/chartex" xmlns:cx5="http://schemas.microsoft.com/office/drawing/2016/5/11/chartex" xmlns:cx6="http://schemas.microsoft.com/office/drawing/2016/5/12/chartex" xmlns:cx7="http://schemas.microsoft.com/office/drawing/2016/5/13/chartex" xmlns:cx8="http://schemas.microsoft.com/office/drawing/2016/5/14/chartex" xmlns:mc="http://schemas.openxmlformats.org/markup-compatibility/2006" xmlns:aink="http://schemas.microsoft.com/office/drawing/2016/ink" xmlns:am3d="http://schemas.microsoft.com/office/drawing/2017/model3d" xmlns:o="urn:schemas-microsoft-com:office:office" xmlns:oel="http://schemas.microsoft.com/office/2019/extlst" xmlns:r="http://schemas.openxmlformats.org/officeDocument/2006/relationships" xmlns:m="http://schemas.openxmlformats.org/officeDocument/2006/math" xmlns:v="urn:schemas-microsoft-com:vml" xmlns:wp14="http://schemas.microsoft.com/office/word/2010/wordprocessingDrawing" xmlns:wp="http://schemas.openxmlformats.org/drawingml/2006/wordprocessingDrawing" xmlns:w10="urn:schemas-microsoft-com:office:word" xmlns:w="http://schemas.openxmlformats.org/wordprocessingml/2006/main" xmlns:w14="http://schemas.microsoft.com/office/word/2010/wordml" xmlns:w15="http://schemas.microsoft.com/office/word/2012/wordml" xmlns:w16cex="http://schemas.microsoft.com/office/word/2018/wordml/cex" xmlns:w16cid="http://schemas.microsoft.com/office/word/2016/wordml/cid" xmlns:w16="http://schemas.microsoft.com/office/word/2018/wordml" xmlns:w16du="http://schemas.microsoft.com/office/word/2023/wordml/word16du" xmlns:w16sdtdh="http://schemas.microsoft.com/office/word/2020/wordml/sdtdatahash" xmlns:w16sdtfl="http://schemas.microsoft.com/office/word/2024/wordml/sdtformatlock" xmlns:w16se="http://schemas.microsoft.com/office/word/2015/wordml/symex" xmlns:wpg="http://schemas.microsoft.com/office/word/2010/wordprocessingGroup" xmlns:wpi="http://schemas.microsoft.com/office/word/2010/wordprocessingInk" xmlns:wne="http://schemas.microsoft.com/office/word/2006/wordml" xmlns:wps="http://schemas.microsoft.com/office/word/2010/wordprocessingShape" mc:Ignorable="w14 w15 w16se w16cid w16 w16cex w16sdtdh w16sdtfl w16du wp14">
   <w:body>
     <w:p>
       <w:pPr>
@@ -23,9 +23,9 @@
           <w:noProof/>
         </w:rPr>
         <w:drawing>
-          <wp:inline distT="0" distB="0" distL="0" distR="0" wp14:anchorId="23A6EAB7" wp14:editId="55874014">
-            <wp:extent cx="6754168" cy="3781953"/>
-            <wp:effectExtent l="0" t="0" r="8890" b="9525"/>
+          <wp:inline distT="0" distB="0" distL="0" distR="0" wp14:anchorId="23A6EAB7" wp14:editId="6DBAB8A2">
+            <wp:extent cx="4347713" cy="2434474"/>
+            <wp:effectExtent l="0" t="0" r="0" b="0"/>
             <wp:docPr id="360661624" name="Picture 1" descr="A screenshot of a computer&#10;&#10;Description automatically generated"/>
             <wp:cNvGraphicFramePr>
               <a:graphicFrameLocks xmlns:a="http://schemas.openxmlformats.org/drawingml/2006/main" noChangeAspect="1"/>
@@ -46,7 +46,7 @@
                   <pic:spPr>
                     <a:xfrm>
                       <a:off x="0" y="0"/>
-                      <a:ext cx="6754168" cy="3781953"/>
+                      <a:ext cx="4359733" cy="2441204"/>
                     </a:xfrm>
                     <a:prstGeom prst="rect">
                       <a:avLst/>
@@ -97,15 +97,7 @@
         <w:t>le it</w:t>
       </w:r>
       <w:r>
-        <w:t xml:space="preserve"> and still run </w:t>
-      </w:r>
-      <w:proofErr w:type="gramStart"/>
-      <w:r>
-        <w:t>Opensimulator</w:t>
-      </w:r>
-      <w:proofErr w:type="gramEnd"/>
-      <w:r>
-        <w:t xml:space="preserve">. If you do not need the </w:t>
+        <w:t xml:space="preserve"> and still run Opensimulator. If you do not need the </w:t>
       </w:r>
       <w:r>
         <w:t>extra</w:t>
@@ -138,23 +130,7 @@
     </w:p>
     <w:p>
       <w:r>
-        <w:t xml:space="preserve">Defaults to </w:t>
-      </w:r>
-      <w:proofErr w:type="gramStart"/>
-      <w:r>
-        <w:t>80</w:t>
-      </w:r>
-      <w:proofErr w:type="gramEnd"/>
-      <w:r>
-        <w:t xml:space="preserve">. If your ISP blocks port </w:t>
-      </w:r>
-      <w:proofErr w:type="gramStart"/>
-      <w:r>
-        <w:t>80</w:t>
-      </w:r>
-      <w:proofErr w:type="gramEnd"/>
-      <w:r>
-        <w:t xml:space="preserve">, try 8000. </w:t>
+        <w:t xml:space="preserve">Defaults to 80. If your ISP blocks port 80, try 8000. </w:t>
       </w:r>
       <w:r>
         <w:t xml:space="preserve">DreamGrid will </w:t>
@@ -163,39 +139,15 @@
         <w:t xml:space="preserve">automatically </w:t>
       </w:r>
       <w:r>
-        <w:t xml:space="preserve">open this port in your PC’s </w:t>
-      </w:r>
-      <w:proofErr w:type="gramStart"/>
-      <w:r>
-        <w:t>firewall</w:t>
-      </w:r>
-      <w:proofErr w:type="gramEnd"/>
-      <w:r>
-        <w:t>.</w:t>
-      </w:r>
-      <w:r>
-        <w:t xml:space="preserve">  You must Port forward whatever port you select in your </w:t>
-      </w:r>
-      <w:proofErr w:type="gramStart"/>
-      <w:r>
-        <w:t>router, or</w:t>
-      </w:r>
-      <w:proofErr w:type="gramEnd"/>
-      <w:r>
-        <w:t xml:space="preserve"> use UPnP.</w:t>
-      </w:r>
-    </w:p>
-    <w:p>
-      <w:r>
-        <w:t xml:space="preserve">If you are going to run </w:t>
-      </w:r>
-      <w:proofErr w:type="gramStart"/>
-      <w:r>
-        <w:t>a</w:t>
-      </w:r>
-      <w:proofErr w:type="gramEnd"/>
-      <w:r>
-        <w:t xml:space="preserve"> SSL connection, this must be on Port 80. </w:t>
+        <w:t>open this port in your PC’s firewall.</w:t>
+      </w:r>
+      <w:r>
+        <w:t xml:space="preserve">  You must Port forward whatever port you select in your router, or use UPnP.</w:t>
+      </w:r>
+    </w:p>
+    <w:p>
+      <w:r>
+        <w:t xml:space="preserve">If you are going to run a SSL connection, this must be on Port 80. </w:t>
       </w:r>
       <w:r>
         <w:t xml:space="preserve"> See the section on SSL below.</w:t>
@@ -219,66 +171,53 @@
     <w:p>
       <w:bookmarkStart w:id="3" w:name="_heading=h.35nkun2" w:colFirst="0" w:colLast="0"/>
       <w:bookmarkEnd w:id="3"/>
-      <w:proofErr w:type="gramStart"/>
+      <w:r>
+        <w:t>Apache will then start when your PC is booted.  No DOS boxes will appear.  The</w:t>
+      </w:r>
+      <w:r>
+        <w:t xml:space="preserve">re </w:t>
+      </w:r>
+      <w:r>
+        <w:t xml:space="preserve">is less clutter and 24-hour operation of the web server.  </w:t>
+      </w:r>
+    </w:p>
+    <w:p>
+      <w:r>
+        <w:t xml:space="preserve">Caution: </w:t>
+      </w:r>
+      <w:r>
+        <w:t>I</w:t>
+      </w:r>
+      <w:r>
+        <w:t xml:space="preserve">f you </w:t>
+      </w:r>
+      <w:r>
+        <w:t xml:space="preserve">move the grid to </w:t>
+      </w:r>
+      <w:r>
+        <w:t>another folder</w:t>
+      </w:r>
+      <w:r>
+        <w:t xml:space="preserve"> after installing Apache</w:t>
+      </w:r>
+      <w:r>
+        <w:t xml:space="preserve">, the server will still attempt to run from the original folder.  </w:t>
+      </w:r>
+      <w:r>
+        <w:t xml:space="preserve">You need to click the Menu at the top of The Main interface and </w:t>
+      </w:r>
+      <w:r>
+        <w:t xml:space="preserve">Delete the Apache Service, </w:t>
+      </w:r>
+      <w:r>
+        <w:t xml:space="preserve">and then </w:t>
+      </w:r>
+      <w:r>
+        <w:t xml:space="preserve">Start </w:t>
+      </w:r>
       <w:r>
         <w:t>Apache</w:t>
       </w:r>
-      <w:proofErr w:type="gramEnd"/>
-      <w:r>
-        <w:t xml:space="preserve"> will then start when your PC is booted.  No DOS boxes will appear.  The</w:t>
-      </w:r>
-      <w:r>
-        <w:t xml:space="preserve">re </w:t>
-      </w:r>
-      <w:r>
-        <w:t xml:space="preserve">is less clutter and 24-hour operation of the web server.  </w:t>
-      </w:r>
-    </w:p>
-    <w:p>
-      <w:r>
-        <w:t xml:space="preserve">Caution: </w:t>
-      </w:r>
-      <w:r>
-        <w:t>I</w:t>
-      </w:r>
-      <w:r>
-        <w:t xml:space="preserve">f you </w:t>
-      </w:r>
-      <w:r>
-        <w:t xml:space="preserve">move the grid to </w:t>
-      </w:r>
-      <w:r>
-        <w:t>another folder</w:t>
-      </w:r>
-      <w:r>
-        <w:t xml:space="preserve"> after installing Apache</w:t>
-      </w:r>
-      <w:r>
-        <w:t xml:space="preserve">, the server will still </w:t>
-      </w:r>
-      <w:proofErr w:type="gramStart"/>
-      <w:r>
-        <w:t>attempt</w:t>
-      </w:r>
-      <w:proofErr w:type="gramEnd"/>
-      <w:r>
-        <w:t xml:space="preserve"> to run from the original folder.  </w:t>
-      </w:r>
-      <w:r>
-        <w:t xml:space="preserve">You need to click the Menu at the top of The Main interface and </w:t>
-      </w:r>
-      <w:r>
-        <w:t xml:space="preserve">Delete the Apache Service, </w:t>
-      </w:r>
-      <w:r>
-        <w:t xml:space="preserve">and then </w:t>
-      </w:r>
-      <w:r>
-        <w:t xml:space="preserve">Start </w:t>
-      </w:r>
-      <w:r>
-        <w:t>Apache</w:t>
-      </w:r>
       <w:r>
         <w:t xml:space="preserve"> Service. It will re-install itself and point to the correct folder.</w:t>
       </w:r>
@@ -288,7 +227,6 @@
         <w:rPr>
           <w:noProof/>
         </w:rPr>
-        <w:lastRenderedPageBreak/>
         <w:drawing>
           <wp:inline distT="0" distB="0" distL="0" distR="0" wp14:anchorId="445DFE80" wp14:editId="7A12DE67">
             <wp:extent cx="2725485" cy="1881553"/>
@@ -333,6 +271,7 @@
       </w:pPr>
       <w:bookmarkStart w:id="4" w:name="_Toc58323667"/>
       <w:r>
+        <w:lastRenderedPageBreak/>
         <w:t>Content Manage</w:t>
       </w:r>
       <w:bookmarkEnd w:id="4"/>
@@ -374,6 +313,9 @@
     </w:p>
     <w:p>
       <w:r>
+        <w:rPr>
+          <w:noProof/>
+        </w:rPr>
         <w:drawing>
           <wp:inline distT="0" distB="0" distL="0" distR="0" wp14:anchorId="16224652" wp14:editId="1599EFFA">
             <wp:extent cx="2324424" cy="2248214"/>
@@ -420,20 +362,14 @@
         <w:t xml:space="preserve">Enable Diva Web Page </w:t>
       </w:r>
       <w:r>
-        <w:t xml:space="preserve">is setup in </w:t>
-      </w:r>
-      <w:r>
-        <w:t>Setup</w:t>
-      </w:r>
-      <w:r>
-        <w:t>-&gt;</w:t>
-      </w:r>
-      <w:r>
-        <w:t xml:space="preserve"> Setting-&gt;Webserver Control Panel section. </w:t>
-      </w:r>
-    </w:p>
-    <w:p>
-      <w:r>
+        <w:t xml:space="preserve">is setup in Setup-&gt; Setting-&gt;Webserver Control Panel section. </w:t>
+      </w:r>
+    </w:p>
+    <w:p>
+      <w:r>
+        <w:rPr>
+          <w:noProof/>
+        </w:rPr>
         <w:drawing>
           <wp:inline distT="0" distB="0" distL="0" distR="0" wp14:anchorId="65FC9D6B" wp14:editId="27300D48">
             <wp:extent cx="1829055" cy="390580"/>
@@ -561,11 +497,6 @@
     </w:p>
     <w:p/>
     <w:p>
-      <w:r>
-        <w:br w:type="page"/>
-      </w:r>
-    </w:p>
-    <w:p>
       <w:pPr>
         <w:pStyle w:val="Heading2"/>
       </w:pPr>
@@ -588,10 +519,14 @@
     </w:p>
     <w:p>
       <w:r>
+        <w:rPr>
+          <w:noProof/>
+        </w:rPr>
+        <w:lastRenderedPageBreak/>
         <w:drawing>
-          <wp:inline distT="0" distB="0" distL="0" distR="0" wp14:anchorId="3212B577" wp14:editId="2C6F4C02">
-            <wp:extent cx="3543795" cy="3458058"/>
-            <wp:effectExtent l="0" t="0" r="0" b="9525"/>
+          <wp:inline distT="0" distB="0" distL="0" distR="0" wp14:anchorId="3212B577" wp14:editId="31589A45">
+            <wp:extent cx="3148642" cy="3072465"/>
+            <wp:effectExtent l="0" t="0" r="0" b="0"/>
             <wp:docPr id="1231924230" name="Picture 1" descr="A screenshot of a computer screen&#10;&#10;Description automatically generated"/>
             <wp:cNvGraphicFramePr>
               <a:graphicFrameLocks xmlns:a="http://schemas.openxmlformats.org/drawingml/2006/main" noChangeAspect="1"/>
@@ -612,7 +547,7 @@
                   <pic:spPr>
                     <a:xfrm>
                       <a:off x="0" y="0"/>
-                      <a:ext cx="3543795" cy="3458058"/>
+                      <a:ext cx="3150931" cy="3074698"/>
                     </a:xfrm>
                     <a:prstGeom prst="rect">
                       <a:avLst/>
@@ -647,15 +582,7 @@
         <w:t>s</w:t>
       </w:r>
       <w:r>
-        <w:t xml:space="preserve">. Wait a minute and the icon will show </w:t>
-      </w:r>
-      <w:proofErr w:type="gramStart"/>
-      <w:r>
-        <w:t>green</w:t>
-      </w:r>
-      <w:proofErr w:type="gramEnd"/>
-      <w:r>
-        <w:t xml:space="preserve"> or it will show it unlocked. </w:t>
+        <w:t xml:space="preserve">. Wait a minute and the icon will show green or it will show it unlocked. </w:t>
       </w:r>
     </w:p>
     <w:p>
@@ -682,15 +609,7 @@
     </w:p>
     <w:p>
       <w:r>
-        <w:t>Detail</w:t>
-      </w:r>
-      <w:proofErr w:type="gramStart"/>
-      <w:r>
-        <w:t>:  It</w:t>
-      </w:r>
-      <w:proofErr w:type="gramEnd"/>
-      <w:r>
-        <w:t xml:space="preserve"> makes a batch </w:t>
+        <w:t xml:space="preserve">Detail:  It makes a batch </w:t>
       </w:r>
       <w:r>
         <w:t xml:space="preserve">file in the </w:t>
@@ -702,18 +621,10 @@
         <w:t>SSL folder. You need to type CMD and run CMD as Administrator. The</w:t>
       </w:r>
       <w:r>
-        <w:t xml:space="preserve">n type cd … to get to the SSL </w:t>
-      </w:r>
-      <w:proofErr w:type="gramStart"/>
-      <w:r>
-        <w:t xml:space="preserve">folder,  </w:t>
-      </w:r>
-      <w:r>
-        <w:t>and</w:t>
-      </w:r>
-      <w:proofErr w:type="gramEnd"/>
-      <w:r>
-        <w:t xml:space="preserve"> type this.</w:t>
+        <w:t xml:space="preserve">n type cd … to get to the SSL folder,  </w:t>
+      </w:r>
+      <w:r>
+        <w:t>and type this.</w:t>
       </w:r>
     </w:p>
     <w:p>
@@ -793,31 +704,9 @@
         <w:t>es</w:t>
       </w:r>
       <w:r>
-        <w:t xml:space="preserve"> into effect when </w:t>
-      </w:r>
-      <w:proofErr w:type="gramStart"/>
-      <w:r>
-        <w:t>Apache</w:t>
-      </w:r>
-      <w:proofErr w:type="gramEnd"/>
-      <w:r>
-        <w:t xml:space="preserve"> restart</w:t>
-      </w:r>
-      <w:r>
-        <w:t>s.</w:t>
-      </w:r>
-    </w:p>
-    <w:p>
-      <w:r>
-        <w:br w:type="page"/>
-      </w:r>
-    </w:p>
-    <w:p>
-      <w:r>
-        <w:t>.</w:t>
-      </w:r>
-    </w:p>
-    <w:p/>
+        <w:t xml:space="preserve"> into effect when Apache restarts.</w:t>
+      </w:r>
+    </w:p>
     <w:p>
       <w:pPr>
         <w:pStyle w:val="Heading2"/>
@@ -840,13 +729,7 @@
         </w:numPr>
       </w:pPr>
       <w:r>
-        <w:t xml:space="preserve">You must </w:t>
-      </w:r>
-      <w:r>
-        <w:t>run</w:t>
-      </w:r>
-      <w:r>
-        <w:t xml:space="preserve"> the Apache webserver.</w:t>
+        <w:t>You must run the Apache webserver.</w:t>
       </w:r>
     </w:p>
     <w:p>
@@ -858,23 +741,7 @@
         </w:numPr>
       </w:pPr>
       <w:r>
-        <w:t xml:space="preserve">Apache must be using port </w:t>
-      </w:r>
-      <w:proofErr w:type="gramStart"/>
-      <w:r>
-        <w:t>80</w:t>
-      </w:r>
-      <w:proofErr w:type="gramEnd"/>
-      <w:r>
-        <w:t xml:space="preserve">.  After this step </w:t>
-      </w:r>
-      <w:proofErr w:type="gramStart"/>
-      <w:r>
-        <w:t>completes</w:t>
-      </w:r>
-      <w:proofErr w:type="gramEnd"/>
-      <w:r>
-        <w:t xml:space="preserve"> you can use port 443 for SSL.</w:t>
+        <w:t>Apache must be using port 80.  After this step completes you can use port 443 for SSL.</w:t>
       </w:r>
     </w:p>
     <w:p>
@@ -898,37 +765,13 @@
         </w:numPr>
       </w:pPr>
       <w:r>
-        <w:t xml:space="preserve">The domain must be accessible from the Internet so the system name can be </w:t>
-      </w:r>
-      <w:proofErr w:type="gramStart"/>
-      <w:r>
-        <w:t>validated</w:t>
-      </w:r>
-      <w:proofErr w:type="gramEnd"/>
-      <w:r>
-        <w:t xml:space="preserve">.  A simple test is to see if canyouseeme.org works on port </w:t>
-      </w:r>
-      <w:proofErr w:type="gramStart"/>
-      <w:r>
-        <w:t>80</w:t>
-      </w:r>
-      <w:proofErr w:type="gramEnd"/>
-      <w:r>
-        <w:t>.  Then try your domain name + :80</w:t>
+        <w:t>The domain must be accessible from the Internet so the system name can be validated.  A simple test is to see if canyouseeme.org works on port 80.  Then try your domain name + :80</w:t>
       </w:r>
     </w:p>
     <w:p/>
     <w:p>
       <w:r>
-        <w:t xml:space="preserve">There is a log specifically for SSL issues. It </w:t>
-      </w:r>
-      <w:proofErr w:type="gramStart"/>
-      <w:r>
-        <w:t>is located in</w:t>
-      </w:r>
-      <w:proofErr w:type="gramEnd"/>
-      <w:r>
-        <w:t xml:space="preserve"> Outworldzfiles\Logs.</w:t>
+        <w:t>There is a log specifically for SSL issues. It is located in Outworldzfiles\Logs.</w:t>
       </w:r>
     </w:p>
     <w:p>
@@ -942,21 +785,22 @@
         <w:rPr>
           <w:rFonts w:ascii="Consolas" w:hAnsi="Consolas" w:cs="Courier New"/>
         </w:rPr>
-        <w:t xml:space="preserve">2022-01-29 </w:t>
-      </w:r>
-      <w:proofErr w:type="gramStart"/>
-      <w:r>
+        <w:t>2022-01-29 00:53:30:OK: A simple Windows ACMEv2 client (WACS)</w:t>
+      </w:r>
+    </w:p>
+    <w:p>
+      <w:pPr>
+        <w:spacing w:line="240" w:lineRule="auto"/>
         <w:rPr>
           <w:rFonts w:ascii="Consolas" w:hAnsi="Consolas" w:cs="Courier New"/>
         </w:rPr>
-        <w:t>00:53:30:OK</w:t>
-      </w:r>
-      <w:proofErr w:type="gramEnd"/>
+      </w:pPr>
       <w:r>
         <w:rPr>
           <w:rFonts w:ascii="Consolas" w:hAnsi="Consolas" w:cs="Courier New"/>
         </w:rPr>
-        <w:t>: A simple Windows ACMEv2 client (WACS)</w:t>
+        <w:lastRenderedPageBreak/>
+        <w:t xml:space="preserve"> Software version 2.1.20.1185 (release, pluggable, standalone, 64-bit)</w:t>
       </w:r>
     </w:p>
     <w:p>
@@ -970,7 +814,7 @@
         <w:rPr>
           <w:rFonts w:ascii="Consolas" w:hAnsi="Consolas" w:cs="Courier New"/>
         </w:rPr>
-        <w:t xml:space="preserve"> Software version 2.1.20.1185 (release, pluggable, standalone, 64-bit)</w:t>
+        <w:t xml:space="preserve"> Connecting to https://acme-v02.api.letsencrypt.org/...</w:t>
       </w:r>
     </w:p>
     <w:p>
@@ -984,7 +828,7 @@
         <w:rPr>
           <w:rFonts w:ascii="Consolas" w:hAnsi="Consolas" w:cs="Courier New"/>
         </w:rPr>
-        <w:t xml:space="preserve"> Connecting to https://acme-v02.api.letsencrypt.org/...</w:t>
+        <w:t xml:space="preserve"> Scheduled task looks healthy</w:t>
       </w:r>
     </w:p>
     <w:p>
@@ -998,7 +842,7 @@
         <w:rPr>
           <w:rFonts w:ascii="Consolas" w:hAnsi="Consolas" w:cs="Courier New"/>
         </w:rPr>
-        <w:t xml:space="preserve"> Scheduled task looks healthy</w:t>
+        <w:t xml:space="preserve"> Please report issues at https://github.com/win-acme/win-acme</w:t>
       </w:r>
     </w:p>
     <w:p>
@@ -1012,7 +856,7 @@
         <w:rPr>
           <w:rFonts w:ascii="Consolas" w:hAnsi="Consolas" w:cs="Courier New"/>
         </w:rPr>
-        <w:t xml:space="preserve"> Please report issues at https://github.com/win-acme/win-acme</w:t>
+        <w:t xml:space="preserve"> Running in mode: Unattended</w:t>
       </w:r>
     </w:p>
     <w:p>
@@ -1026,7 +870,7 @@
         <w:rPr>
           <w:rFonts w:ascii="Consolas" w:hAnsi="Consolas" w:cs="Courier New"/>
         </w:rPr>
-        <w:t xml:space="preserve"> Running in mode: Unattended</w:t>
+        <w:t xml:space="preserve"> Source generated using plugin Manual: smartboot.outworldz.net</w:t>
       </w:r>
     </w:p>
     <w:p>
@@ -1040,7 +884,7 @@
         <w:rPr>
           <w:rFonts w:ascii="Consolas" w:hAnsi="Consolas" w:cs="Courier New"/>
         </w:rPr>
-        <w:t xml:space="preserve"> Source generated using plugin Manual: smartboot.outworldz.net</w:t>
+        <w:t xml:space="preserve"> Overwriting previously created renewal</w:t>
       </w:r>
     </w:p>
     <w:p>
@@ -1054,7 +898,7 @@
         <w:rPr>
           <w:rFonts w:ascii="Consolas" w:hAnsi="Consolas" w:cs="Courier New"/>
         </w:rPr>
-        <w:t xml:space="preserve"> Overwriting previously created renewal</w:t>
+        <w:t xml:space="preserve"> Using cache for [Manual] smartboot.outworldz.net. To get a new certificate within 1 days, run with --force.</w:t>
       </w:r>
     </w:p>
     <w:p>
@@ -1068,7 +912,7 @@
         <w:rPr>
           <w:rFonts w:ascii="Consolas" w:hAnsi="Consolas" w:cs="Courier New"/>
         </w:rPr>
-        <w:t xml:space="preserve"> Using cache for [Manual] smartboot.outworldz.net. To get a new certificate within 1 days, run with --force.</w:t>
+        <w:t xml:space="preserve"> Store with PemFiles...</w:t>
       </w:r>
     </w:p>
     <w:p>
@@ -1082,49 +926,7 @@
         <w:rPr>
           <w:rFonts w:ascii="Consolas" w:hAnsi="Consolas" w:cs="Courier New"/>
         </w:rPr>
-        <w:t xml:space="preserve"> Store with </w:t>
-      </w:r>
-      <w:proofErr w:type="spellStart"/>
-      <w:r>
-        <w:rPr>
-          <w:rFonts w:ascii="Consolas" w:hAnsi="Consolas" w:cs="Courier New"/>
-        </w:rPr>
-        <w:t>PemFiles</w:t>
-      </w:r>
-      <w:proofErr w:type="spellEnd"/>
-      <w:r>
-        <w:rPr>
-          <w:rFonts w:ascii="Consolas" w:hAnsi="Consolas" w:cs="Courier New"/>
-        </w:rPr>
-        <w:t>...</w:t>
-      </w:r>
-    </w:p>
-    <w:p>
-      <w:pPr>
-        <w:spacing w:line="240" w:lineRule="auto"/>
-        <w:rPr>
-          <w:rFonts w:ascii="Consolas" w:hAnsi="Consolas" w:cs="Courier New"/>
-        </w:rPr>
-      </w:pPr>
-      <w:r>
-        <w:rPr>
-          <w:rFonts w:ascii="Consolas" w:hAnsi="Consolas" w:cs="Courier New"/>
-        </w:rPr>
-        <w:t xml:space="preserve"> Exporting .</w:t>
-      </w:r>
-      <w:proofErr w:type="spellStart"/>
-      <w:r>
-        <w:rPr>
-          <w:rFonts w:ascii="Consolas" w:hAnsi="Consolas" w:cs="Courier New"/>
-        </w:rPr>
-        <w:t>pem</w:t>
-      </w:r>
-      <w:proofErr w:type="spellEnd"/>
-      <w:r>
-        <w:rPr>
-          <w:rFonts w:ascii="Consolas" w:hAnsi="Consolas" w:cs="Courier New"/>
-        </w:rPr>
-        <w:t xml:space="preserve"> files to C:\Users\</w:t>
+        <w:t xml:space="preserve"> Exporting .pem files to C:\Users\</w:t>
       </w:r>
       <w:r>
         <w:rPr>
@@ -1182,25 +984,25 @@
           <w:sz w:val="16"/>
           <w:szCs w:val="16"/>
         </w:rPr>
-        <w:t xml:space="preserve"> Next renewal scheduled </w:t>
-      </w:r>
-      <w:proofErr w:type="gramStart"/>
-      <w:r>
+        <w:t xml:space="preserve"> Next renewal scheduled at 2022/3/25 5:40:43</w:t>
+      </w:r>
+    </w:p>
+    <w:p>
+      <w:pPr>
+        <w:spacing w:line="240" w:lineRule="auto"/>
         <w:rPr>
           <w:rFonts w:ascii="Consolas" w:hAnsi="Consolas" w:cs="Courier New"/>
           <w:sz w:val="16"/>
           <w:szCs w:val="16"/>
         </w:rPr>
-        <w:t>at</w:t>
-      </w:r>
-      <w:proofErr w:type="gramEnd"/>
+      </w:pPr>
       <w:r>
         <w:rPr>
           <w:rFonts w:ascii="Consolas" w:hAnsi="Consolas" w:cs="Courier New"/>
           <w:sz w:val="16"/>
           <w:szCs w:val="16"/>
         </w:rPr>
-        <w:t xml:space="preserve"> 2022/3/25 5:40:43</w:t>
+        <w:t xml:space="preserve"> Certificate [Manual] smartboot.outworldz.net created</w:t>
       </w:r>
     </w:p>
     <w:p>
@@ -1218,43 +1020,7 @@
           <w:sz w:val="16"/>
           <w:szCs w:val="16"/>
         </w:rPr>
-        <w:t xml:space="preserve"> Certificate [Manual] smartboot.outworldz.net created</w:t>
-      </w:r>
-    </w:p>
-    <w:p>
-      <w:pPr>
-        <w:spacing w:line="240" w:lineRule="auto"/>
-        <w:rPr>
-          <w:rFonts w:ascii="Consolas" w:hAnsi="Consolas" w:cs="Courier New"/>
-          <w:sz w:val="16"/>
-          <w:szCs w:val="16"/>
-        </w:rPr>
-      </w:pPr>
-      <w:r>
-        <w:rPr>
-          <w:rFonts w:ascii="Consolas" w:hAnsi="Consolas" w:cs="Courier New"/>
-          <w:sz w:val="16"/>
-          <w:szCs w:val="16"/>
-        </w:rPr>
-        <w:t xml:space="preserve">2022-01-29 </w:t>
-      </w:r>
-      <w:proofErr w:type="gramStart"/>
-      <w:r>
-        <w:rPr>
-          <w:rFonts w:ascii="Consolas" w:hAnsi="Consolas" w:cs="Courier New"/>
-          <w:sz w:val="16"/>
-          <w:szCs w:val="16"/>
-        </w:rPr>
-        <w:t>00:53:31:Info</w:t>
-      </w:r>
-      <w:proofErr w:type="gramEnd"/>
-      <w:r>
-        <w:rPr>
-          <w:rFonts w:ascii="Consolas" w:hAnsi="Consolas" w:cs="Courier New"/>
-          <w:sz w:val="16"/>
-          <w:szCs w:val="16"/>
-        </w:rPr>
-        <w:t>:Certificate installed</w:t>
+        <w:t>2022-01-29 00:53:31:Info:Certificate installed</w:t>
       </w:r>
     </w:p>
     <w:bookmarkEnd w:id="0"/>
@@ -1278,7 +1044,7 @@
 </file>
 
 <file path=word/numbering.xml><?xml version="1.0" encoding="utf-8"?>
-<w:numbering xmlns:wpc="http://schemas.microsoft.com/office/word/2010/wordprocessingCanvas" xmlns:cx="http://schemas.microsoft.com/office/drawing/2014/chartex" xmlns:cx1="http://schemas.microsoft.com/office/drawing/2015/9/8/chartex" xmlns:cx2="http://schemas.microsoft.com/office/drawing/2015/10/21/chartex" xmlns:cx3="http://schemas.microsoft.com/office/drawing/2016/5/9/chartex" xmlns:cx4="http://schemas.microsoft.com/office/drawing/2016/5/10/chartex" xmlns:cx5="http://schemas.microsoft.com/office/drawing/2016/5/11/chartex" xmlns:cx6="http://schemas.microsoft.com/office/drawing/2016/5/12/chartex" xmlns:cx7="http://schemas.microsoft.com/office/drawing/2016/5/13/chartex" xmlns:cx8="http://schemas.microsoft.com/office/drawing/2016/5/14/chartex" xmlns:mc="http://schemas.openxmlformats.org/markup-compatibility/2006" xmlns:aink="http://schemas.microsoft.com/office/drawing/2016/ink" xmlns:am3d="http://schemas.microsoft.com/office/drawing/2017/model3d" xmlns:o="urn:schemas-microsoft-com:office:office" xmlns:oel="http://schemas.microsoft.com/office/2019/extlst" xmlns:r="http://schemas.openxmlformats.org/officeDocument/2006/relationships" xmlns:m="http://schemas.openxmlformats.org/officeDocument/2006/math" xmlns:v="urn:schemas-microsoft-com:vml" xmlns:wp14="http://schemas.microsoft.com/office/word/2010/wordprocessingDrawing" xmlns:wp="http://schemas.openxmlformats.org/drawingml/2006/wordprocessingDrawing" xmlns:w10="urn:schemas-microsoft-com:office:word" xmlns:w="http://schemas.openxmlformats.org/wordprocessingml/2006/main" xmlns:w14="http://schemas.microsoft.com/office/word/2010/wordml" xmlns:w15="http://schemas.microsoft.com/office/word/2012/wordml" xmlns:w16cex="http://schemas.microsoft.com/office/word/2018/wordml/cex" xmlns:w16cid="http://schemas.microsoft.com/office/word/2016/wordml/cid" xmlns:w16="http://schemas.microsoft.com/office/word/2018/wordml" xmlns:w16du="http://schemas.microsoft.com/office/word/2023/wordml/word16du" xmlns:w16sdtdh="http://schemas.microsoft.com/office/word/2020/wordml/sdtdatahash" xmlns:w16se="http://schemas.microsoft.com/office/word/2015/wordml/symex" xmlns:wpg="http://schemas.microsoft.com/office/word/2010/wordprocessingGroup" xmlns:wpi="http://schemas.microsoft.com/office/word/2010/wordprocessingInk" xmlns:wne="http://schemas.microsoft.com/office/word/2006/wordml" xmlns:wps="http://schemas.microsoft.com/office/word/2010/wordprocessingShape" mc:Ignorable="w14 w15 w16se w16cid w16 w16cex w16sdtdh w16du wp14">
+<w:numbering xmlns:wpc="http://schemas.microsoft.com/office/word/2010/wordprocessingCanvas" xmlns:cx="http://schemas.microsoft.com/office/drawing/2014/chartex" xmlns:cx1="http://schemas.microsoft.com/office/drawing/2015/9/8/chartex" xmlns:cx2="http://schemas.microsoft.com/office/drawing/2015/10/21/chartex" xmlns:cx3="http://schemas.microsoft.com/office/drawing/2016/5/9/chartex" xmlns:cx4="http://schemas.microsoft.com/office/drawing/2016/5/10/chartex" xmlns:cx5="http://schemas.microsoft.com/office/drawing/2016/5/11/chartex" xmlns:cx6="http://schemas.microsoft.com/office/drawing/2016/5/12/chartex" xmlns:cx7="http://schemas.microsoft.com/office/drawing/2016/5/13/chartex" xmlns:cx8="http://schemas.microsoft.com/office/drawing/2016/5/14/chartex" xmlns:mc="http://schemas.openxmlformats.org/markup-compatibility/2006" xmlns:aink="http://schemas.microsoft.com/office/drawing/2016/ink" xmlns:am3d="http://schemas.microsoft.com/office/drawing/2017/model3d" xmlns:o="urn:schemas-microsoft-com:office:office" xmlns:oel="http://schemas.microsoft.com/office/2019/extlst" xmlns:r="http://schemas.openxmlformats.org/officeDocument/2006/relationships" xmlns:m="http://schemas.openxmlformats.org/officeDocument/2006/math" xmlns:v="urn:schemas-microsoft-com:vml" xmlns:wp14="http://schemas.microsoft.com/office/word/2010/wordprocessingDrawing" xmlns:wp="http://schemas.openxmlformats.org/drawingml/2006/wordprocessingDrawing" xmlns:w10="urn:schemas-microsoft-com:office:word" xmlns:w="http://schemas.openxmlformats.org/wordprocessingml/2006/main" xmlns:w14="http://schemas.microsoft.com/office/word/2010/wordml" xmlns:w15="http://schemas.microsoft.com/office/word/2012/wordml" xmlns:w16cex="http://schemas.microsoft.com/office/word/2018/wordml/cex" xmlns:w16cid="http://schemas.microsoft.com/office/word/2016/wordml/cid" xmlns:w16="http://schemas.microsoft.com/office/word/2018/wordml" xmlns:w16du="http://schemas.microsoft.com/office/word/2023/wordml/word16du" xmlns:w16sdtdh="http://schemas.microsoft.com/office/word/2020/wordml/sdtdatahash" xmlns:w16sdtfl="http://schemas.microsoft.com/office/word/2024/wordml/sdtformatlock" xmlns:w16se="http://schemas.microsoft.com/office/word/2015/wordml/symex" xmlns:wpg="http://schemas.microsoft.com/office/word/2010/wordprocessingGroup" xmlns:wpi="http://schemas.microsoft.com/office/word/2010/wordprocessingInk" xmlns:wne="http://schemas.microsoft.com/office/word/2006/wordml" xmlns:wps="http://schemas.microsoft.com/office/word/2010/wordprocessingShape" mc:Ignorable="w14 w15 w16se w16cid w16 w16cex w16sdtdh w16sdtfl w16du wp14">
   <w:abstractNum w:abstractNumId="0" w15:restartNumberingAfterBreak="0">
     <w:nsid w:val="0AB16B03"/>
     <w:multiLevelType w:val="multilevel"/>
@@ -2125,7 +1891,7 @@
 </file>
 
 <file path=word/styles.xml><?xml version="1.0" encoding="utf-8"?>
-<w:styles xmlns:mc="http://schemas.openxmlformats.org/markup-compatibility/2006" xmlns:r="http://schemas.openxmlformats.org/officeDocument/2006/relationships" xmlns:w="http://schemas.openxmlformats.org/wordprocessingml/2006/main" xmlns:w14="http://schemas.microsoft.com/office/word/2010/wordml" xmlns:w15="http://schemas.microsoft.com/office/word/2012/wordml" xmlns:w16cex="http://schemas.microsoft.com/office/word/2018/wordml/cex" xmlns:w16cid="http://schemas.microsoft.com/office/word/2016/wordml/cid" xmlns:w16="http://schemas.microsoft.com/office/word/2018/wordml" xmlns:w16du="http://schemas.microsoft.com/office/word/2023/wordml/word16du" xmlns:w16sdtdh="http://schemas.microsoft.com/office/word/2020/wordml/sdtdatahash" xmlns:w16se="http://schemas.microsoft.com/office/word/2015/wordml/symex" mc:Ignorable="w14 w15 w16se w16cid w16 w16cex w16sdtdh w16du">
+<w:styles xmlns:mc="http://schemas.openxmlformats.org/markup-compatibility/2006" xmlns:r="http://schemas.openxmlformats.org/officeDocument/2006/relationships" xmlns:w="http://schemas.openxmlformats.org/wordprocessingml/2006/main" xmlns:w14="http://schemas.microsoft.com/office/word/2010/wordml" xmlns:w15="http://schemas.microsoft.com/office/word/2012/wordml" xmlns:w16cex="http://schemas.microsoft.com/office/word/2018/wordml/cex" xmlns:w16cid="http://schemas.microsoft.com/office/word/2016/wordml/cid" xmlns:w16="http://schemas.microsoft.com/office/word/2018/wordml" xmlns:w16du="http://schemas.microsoft.com/office/word/2023/wordml/word16du" xmlns:w16sdtdh="http://schemas.microsoft.com/office/word/2020/wordml/sdtdatahash" xmlns:w16sdtfl="http://schemas.microsoft.com/office/word/2024/wordml/sdtformatlock" xmlns:w16se="http://schemas.microsoft.com/office/word/2015/wordml/symex" mc:Ignorable="w14 w15 w16se w16cid w16 w16cex w16sdtdh w16sdtfl w16du">
   <w:docDefaults>
     <w:rPrDefault>
       <w:rPr>

</xml_diff>